<commit_message>
Run training with llm reasoning reg
</commit_message>
<xml_diff>
--- a/5_llm_reasoning/Summarising ideas.docx
+++ b/5_llm_reasoning/Summarising ideas.docx
@@ -622,282 +622,493 @@
       </w:r>
       <w:r>
         <w:br/>
-        <w:t>Output format:</w:t>
-      </w:r>
-      <w:r>
-        <w:br/>
+      </w:r>
+    </w:p>
+    <w:p/>
+    <w:p/>
+    <w:p>
+      <w:r>
+        <w:lastRenderedPageBreak/>
+        <w:t>Experiment B:</w:t>
+      </w:r>
+    </w:p>
+    <w:p>
+      <w:r>
+        <w:t>Use the following rubric:</w:t>
+      </w:r>
+      <w:r>
+        <w:br/>
+      </w:r>
+      <w:r>
+        <w:br/>
+        <w:t>Top founder:</w:t>
+      </w:r>
+      <w:r>
+        <w:br/>
+        <w:t>- rapid progression or early leadership</w:t>
+      </w:r>
+      <w:r>
+        <w:br/>
+        <w:t>- ownership in ambiguous environments</w:t>
+      </w:r>
+      <w:r>
+        <w:br/>
+        <w:t>- operates in high-growth or technical contexts</w:t>
+      </w:r>
+      <w:r>
+        <w:br/>
+      </w:r>
+      <w:r>
+        <w:br/>
+        <w:t>Weak founder:</w:t>
+      </w:r>
+      <w:r>
+        <w:br/>
+        <w:t>- limited ownership</w:t>
+      </w:r>
+      <w:r>
+        <w:br/>
+        <w:t>- slow progression</w:t>
+      </w:r>
+      <w:r>
+        <w:br/>
+        <w:t>- inconsistent direction</w:t>
+      </w:r>
+      <w:r>
+        <w:br/>
+      </w:r>
+      <w:r>
+        <w:br/>
+        <w:t>Score relative to this rubric (1–5).</w:t>
+      </w:r>
+    </w:p>
+    <w:p/>
+    <w:p>
+      <w:r>
+        <w:t>Experiment C:</w:t>
+      </w:r>
+    </w:p>
+    <w:p>
+      <w:r>
+        <w:t xml:space="preserve">Identify 3 signals that are NOT directly measurable </w:t>
+      </w:r>
+      <w:r>
+        <w:br/>
+        <w:t>(e.g. not degree, company name, or years of experience).</w:t>
+      </w:r>
+      <w:r>
+        <w:br/>
+      </w:r>
+      <w:r>
+        <w:br/>
+        <w:t>Then score:</w:t>
+      </w:r>
+      <w:r>
+        <w:br/>
+        <w:t xml:space="preserve">- </w:t>
+      </w:r>
+      <w:proofErr w:type="spellStart"/>
+      <w:r>
+        <w:t>latent_strength</w:t>
+      </w:r>
+      <w:proofErr w:type="spellEnd"/>
+      <w:r>
+        <w:t>: 1–5</w:t>
+      </w:r>
+      <w:r>
+        <w:br/>
+        <w:t xml:space="preserve">- </w:t>
+      </w:r>
+      <w:proofErr w:type="spellStart"/>
+      <w:r>
+        <w:t>latent_risk</w:t>
+      </w:r>
+      <w:proofErr w:type="spellEnd"/>
+      <w:r>
+        <w:t>: 1–5</w:t>
+      </w:r>
+      <w:r>
+        <w:br/>
+      </w:r>
+      <w:r>
+        <w:br/>
+        <w:t>Also output the 3 signals.</w:t>
+      </w:r>
+    </w:p>
+    <w:p/>
+    <w:p>
+      <w:r>
+        <w:t>Experiment D:</w:t>
+      </w:r>
+    </w:p>
+    <w:p>
+      <w:r>
+        <w:t>List:</w:t>
+      </w:r>
+      <w:r>
+        <w:br/>
+      </w:r>
+      <w:r>
+        <w:br/>
+        <w:t>- top_3_strengths (categorical labels)</w:t>
+      </w:r>
+      <w:r>
+        <w:br/>
+        <w:t>- top_3_weaknesses (categorical labels)</w:t>
+      </w:r>
+      <w:r>
+        <w:br/>
+      </w:r>
+      <w:r>
+        <w:br/>
+        <w:t>Then score:</w:t>
+      </w:r>
+      <w:r>
+        <w:br/>
+        <w:t xml:space="preserve">- </w:t>
+      </w:r>
+      <w:proofErr w:type="spellStart"/>
+      <w:r>
+        <w:t>overall_founder_quality</w:t>
+      </w:r>
+      <w:proofErr w:type="spellEnd"/>
+      <w:r>
+        <w:t>: 1–5</w:t>
+      </w:r>
+    </w:p>
+    <w:p/>
+    <w:p>
+      <w:r>
+        <w:t>Experiment E:</w:t>
+      </w:r>
+    </w:p>
+    <w:p>
+      <w:r>
+        <w:t xml:space="preserve">What aspects of this founder would be underrated </w:t>
+      </w:r>
+      <w:r>
+        <w:br/>
+        <w:t>or misleading if judged only by traditional metrics?</w:t>
+      </w:r>
+      <w:r>
+        <w:br/>
+      </w:r>
+      <w:r>
+        <w:br/>
+        <w:t>Then score:</w:t>
+      </w:r>
+      <w:r>
+        <w:br/>
+        <w:t xml:space="preserve">- </w:t>
+      </w:r>
+      <w:proofErr w:type="spellStart"/>
+      <w:r>
+        <w:t>hidden_upside</w:t>
+      </w:r>
+      <w:proofErr w:type="spellEnd"/>
+      <w:r>
+        <w:t>: 1–5</w:t>
+      </w:r>
+      <w:r>
+        <w:br/>
+        <w:t xml:space="preserve">- </w:t>
+      </w:r>
+      <w:proofErr w:type="spellStart"/>
+      <w:r>
+        <w:t>hidden_risk</w:t>
+      </w:r>
+      <w:proofErr w:type="spellEnd"/>
+      <w:r>
+        <w:t>: 1–5</w:t>
+      </w:r>
+    </w:p>
+    <w:p/>
+    <w:p/>
+    <w:p/>
+    <w:p>
+      <w:pPr>
+        <w:pStyle w:val="Heading2"/>
+      </w:pPr>
+      <w:r>
+        <w:t>Potential to include a critic LLM</w:t>
+      </w:r>
+    </w:p>
+    <w:p>
+      <w:r>
+        <w:t>You are reviewing a founder-evaluation prompt.</w:t>
+      </w:r>
+      <w:r>
+        <w:br/>
+      </w:r>
+      <w:r>
+        <w:br/>
+        <w:t>Your task is to identify flaws in the scoring reasons produced by another model.</w:t>
+      </w:r>
+      <w:r>
+        <w:br/>
+      </w:r>
+      <w:r>
+        <w:br/>
+        <w:t>Check for:</w:t>
+      </w:r>
+      <w:r>
+        <w:br/>
+        <w:t>- reliance on prestige or brand-name shortcuts</w:t>
+      </w:r>
+      <w:r>
+        <w:br/>
+        <w:t>- unsupported inference</w:t>
+      </w:r>
+      <w:r>
+        <w:br/>
+        <w:t>- circular reasoning</w:t>
+      </w:r>
+      <w:r>
+        <w:br/>
+        <w:t>- vague wording</w:t>
+      </w:r>
+      <w:r>
+        <w:br/>
+        <w:t>- duplicated logic across different scores</w:t>
+      </w:r>
+      <w:r>
+        <w:br/>
+        <w:t>- failure to distinguish between ownership, trajectory, and coherence</w:t>
+      </w:r>
+      <w:r>
+        <w:br/>
+        <w:t>- overuse of title-based assumptions</w:t>
+      </w:r>
+      <w:r>
+        <w:br/>
+      </w:r>
+      <w:r>
+        <w:br/>
+        <w:t>For each flaw, quote the problematic reason, explain the issue, and suggest a minimal prompt modification to reduce that flaw.</w:t>
+      </w:r>
+      <w:r>
+        <w:br/>
+      </w:r>
+      <w:r>
+        <w:br/>
+        <w:t>Do not rewrite the whole prompt unless necessary.</w:t>
+      </w:r>
+    </w:p>
+    <w:p/>
+    <w:p>
+      <w:pPr>
+        <w:pStyle w:val="Heading2"/>
+      </w:pPr>
+      <w:r>
+        <w:t xml:space="preserve">Judging confidence </w:t>
+      </w:r>
+      <w:proofErr w:type="spellStart"/>
+      <w:r>
+        <w:t>o</w:t>
+      </w:r>
+      <w:proofErr w:type="spellEnd"/>
+      <w:r>
+        <w:t xml:space="preserve"> the 1</w:t>
+      </w:r>
+      <w:r>
+        <w:rPr>
+          <w:vertAlign w:val="superscript"/>
+        </w:rPr>
+        <w:t>st</w:t>
+      </w:r>
+      <w:r>
+        <w:t xml:space="preserve"> </w:t>
+      </w:r>
+      <w:proofErr w:type="spellStart"/>
+      <w:r>
+        <w:t>llm</w:t>
+      </w:r>
+      <w:proofErr w:type="spellEnd"/>
+    </w:p>
+    <w:p>
+      <w:r>
+        <w:t>“Given the founder profile, the score, and the reason, how well-supported is this score by observable evidence?”</w:t>
+      </w:r>
+    </w:p>
+    <w:p>
+      <w:pPr>
+        <w:rPr>
+          <w:b/>
+          <w:bCs/>
+        </w:rPr>
+      </w:pPr>
+      <w:r>
+        <w:rPr>
+          <w:b/>
+          <w:bCs/>
+        </w:rPr>
+        <w:t>1. Evidence sufficiency</w:t>
+      </w:r>
+    </w:p>
+    <w:p>
+      <w:r>
+        <w:t>“How much information is there to support this score?”</w:t>
+      </w:r>
+    </w:p>
+    <w:p>
+      <w:r>
+        <w:t>This is often useful. A founder with sparse data may get a score, but you want to know the score is weakly supported.</w:t>
+      </w:r>
+    </w:p>
+    <w:p>
+      <w:r>
+        <w:t>Example:</w:t>
+      </w:r>
+    </w:p>
+    <w:p>
+      <w:r>
         <w:t>{</w:t>
       </w:r>
       <w:r>
         <w:br/>
-        <w:t>"</w:t>
+        <w:t xml:space="preserve">  "</w:t>
       </w:r>
       <w:proofErr w:type="spellStart"/>
       <w:r>
-        <w:t>trajectory_strength</w:t>
+        <w:t>ownership_signal</w:t>
       </w:r>
       <w:proofErr w:type="spellEnd"/>
       <w:r>
-        <w:t>": int,</w:t>
-      </w:r>
-      <w:r>
-        <w:br/>
-        <w:t>"</w:t>
+        <w:t>": 4,</w:t>
+      </w:r>
+      <w:r>
+        <w:br/>
+        <w:t xml:space="preserve">  "</w:t>
       </w:r>
       <w:proofErr w:type="spellStart"/>
       <w:r>
-        <w:t>ownership_signal</w:t>
+        <w:t>ownership_confidence</w:t>
       </w:r>
       <w:proofErr w:type="spellEnd"/>
       <w:r>
-        <w:t>": int,</w:t>
-      </w:r>
-      <w:r>
-        <w:br/>
-        <w:t>"</w:t>
-      </w:r>
-      <w:proofErr w:type="spellStart"/>
-      <w:r>
-        <w:t>career_coherence</w:t>
-      </w:r>
-      <w:proofErr w:type="spellEnd"/>
-      <w:r>
-        <w:t>": int,</w:t>
-      </w:r>
-      <w:r>
-        <w:br/>
-      </w:r>
+        <w:t>": 2</w:t>
+      </w:r>
+      <w:r>
+        <w:br/>
+        <w:t>}</w:t>
+      </w:r>
+    </w:p>
+    <w:p>
+      <w:r>
+        <w:t>Interpretation:</w:t>
+      </w:r>
+    </w:p>
+    <w:p>
+      <w:pPr>
+        <w:numPr>
+          <w:ilvl w:val="0"/>
+          <w:numId w:val="3"/>
+        </w:numPr>
+      </w:pPr>
+      <w:r>
+        <w:t>score says “looks strong”</w:t>
+      </w:r>
+    </w:p>
+    <w:p>
+      <w:pPr>
+        <w:numPr>
+          <w:ilvl w:val="0"/>
+          <w:numId w:val="3"/>
+        </w:numPr>
+      </w:pPr>
+      <w:r>
+        <w:t>confidence says “but evidence is thin”</w:t>
+      </w:r>
+    </w:p>
+    <w:p>
+      <w:r>
+        <w:t>That can absolutely be a useful regression feature.</w:t>
+      </w:r>
+    </w:p>
+    <w:p>
+      <w:pPr>
+        <w:rPr>
+          <w:b/>
+          <w:bCs/>
+        </w:rPr>
+      </w:pPr>
+      <w:r>
+        <w:rPr>
+          <w:b/>
+          <w:bCs/>
+        </w:rPr>
+        <w:t>2. Dimension separability</w:t>
+      </w:r>
+    </w:p>
+    <w:p>
       <w:r>
         <w:lastRenderedPageBreak/>
-        <w:t>"scrappiness": int,</w:t>
-      </w:r>
-      <w:r>
-        <w:br/>
-        <w:t>"</w:t>
-      </w:r>
-      <w:proofErr w:type="spellStart"/>
-      <w:r>
-        <w:t>non_obvious_strength</w:t>
-      </w:r>
-      <w:proofErr w:type="spellEnd"/>
-      <w:r>
-        <w:t>": "...",</w:t>
-      </w:r>
-      <w:r>
-        <w:br/>
-        <w:t>"</w:t>
-      </w:r>
-      <w:proofErr w:type="spellStart"/>
-      <w:r>
-        <w:t>non_obvious_risk</w:t>
-      </w:r>
-      <w:proofErr w:type="spellEnd"/>
-      <w:r>
-        <w:t>": "..."</w:t>
-      </w:r>
-      <w:r>
-        <w:br/>
-        <w:t>}</w:t>
-      </w:r>
-    </w:p>
-    <w:p/>
-    <w:p/>
-    <w:p>
-      <w:r>
-        <w:t>Experiment B:</w:t>
-      </w:r>
-    </w:p>
-    <w:p>
-      <w:r>
-        <w:t>Use the following rubric:</w:t>
-      </w:r>
-      <w:r>
-        <w:br/>
-      </w:r>
-      <w:r>
-        <w:br/>
-        <w:t>Top founder:</w:t>
-      </w:r>
-      <w:r>
-        <w:br/>
-        <w:t>- rapid progression or early leadership</w:t>
-      </w:r>
-      <w:r>
-        <w:br/>
-        <w:t>- ownership in ambiguous environments</w:t>
-      </w:r>
-      <w:r>
-        <w:br/>
-        <w:t>- operates in high-growth or technical contexts</w:t>
-      </w:r>
-      <w:r>
-        <w:br/>
-      </w:r>
-      <w:r>
-        <w:br/>
-        <w:t>Weak founder:</w:t>
-      </w:r>
-      <w:r>
-        <w:br/>
-        <w:t>- limited ownership</w:t>
-      </w:r>
-      <w:r>
-        <w:br/>
-        <w:t>- slow progression</w:t>
-      </w:r>
-      <w:r>
-        <w:br/>
-        <w:t>- inconsistent direction</w:t>
-      </w:r>
-      <w:r>
-        <w:br/>
-      </w:r>
-      <w:r>
-        <w:br/>
-        <w:t>Score relative to this rubric (1–5).</w:t>
-      </w:r>
-    </w:p>
-    <w:p/>
-    <w:p>
-      <w:r>
-        <w:t>Experiment C:</w:t>
-      </w:r>
-    </w:p>
-    <w:p>
-      <w:r>
-        <w:t xml:space="preserve">Identify 3 signals that are NOT directly measurable </w:t>
-      </w:r>
-      <w:r>
-        <w:br/>
-        <w:t>(e.g. not degree, company name, or years of experience).</w:t>
-      </w:r>
-      <w:r>
-        <w:br/>
-      </w:r>
-      <w:r>
-        <w:br/>
-        <w:t>Then score:</w:t>
-      </w:r>
-      <w:r>
-        <w:br/>
-        <w:t xml:space="preserve">- </w:t>
-      </w:r>
-      <w:proofErr w:type="spellStart"/>
-      <w:r>
-        <w:t>latent_strength</w:t>
-      </w:r>
-      <w:proofErr w:type="spellEnd"/>
-      <w:r>
-        <w:t>: 1–5</w:t>
-      </w:r>
-      <w:r>
-        <w:br/>
-        <w:t xml:space="preserve">- </w:t>
-      </w:r>
-      <w:proofErr w:type="spellStart"/>
-      <w:r>
-        <w:t>latent_risk</w:t>
-      </w:r>
-      <w:proofErr w:type="spellEnd"/>
-      <w:r>
-        <w:t>: 1–5</w:t>
-      </w:r>
-      <w:r>
-        <w:br/>
-      </w:r>
-      <w:r>
-        <w:br/>
-        <w:t>Also output the 3 signals.</w:t>
-      </w:r>
-    </w:p>
-    <w:p/>
-    <w:p>
-      <w:r>
-        <w:t>Experiment D:</w:t>
-      </w:r>
-    </w:p>
-    <w:p>
-      <w:r>
-        <w:t>List:</w:t>
-      </w:r>
-      <w:r>
-        <w:br/>
-      </w:r>
-      <w:r>
-        <w:br/>
-        <w:t>- top_3_strengths (categorical labels)</w:t>
-      </w:r>
-      <w:r>
-        <w:br/>
-        <w:t>- top_3_weaknesses (categorical labels)</w:t>
-      </w:r>
-      <w:r>
-        <w:br/>
-      </w:r>
-      <w:r>
-        <w:br/>
-        <w:t>Then score:</w:t>
-      </w:r>
-      <w:r>
-        <w:br/>
-        <w:t xml:space="preserve">- </w:t>
-      </w:r>
-      <w:proofErr w:type="spellStart"/>
-      <w:r>
-        <w:t>overall_founder_quality</w:t>
-      </w:r>
-      <w:proofErr w:type="spellEnd"/>
-      <w:r>
-        <w:t>: 1–5</w:t>
-      </w:r>
-    </w:p>
-    <w:p/>
-    <w:p>
-      <w:r>
-        <w:t>Experiment E:</w:t>
-      </w:r>
-    </w:p>
-    <w:p>
-      <w:r>
-        <w:lastRenderedPageBreak/>
-        <w:t xml:space="preserve">What aspects of this founder would be underrated </w:t>
-      </w:r>
-      <w:r>
-        <w:br/>
-        <w:t>or misleading if judged only by traditional metrics?</w:t>
-      </w:r>
-      <w:r>
-        <w:br/>
-      </w:r>
-      <w:r>
-        <w:br/>
-        <w:t>Then score:</w:t>
-      </w:r>
-      <w:r>
-        <w:br/>
-        <w:t xml:space="preserve">- </w:t>
-      </w:r>
-      <w:proofErr w:type="spellStart"/>
-      <w:r>
-        <w:t>hidden_upside</w:t>
-      </w:r>
-      <w:proofErr w:type="spellEnd"/>
-      <w:r>
-        <w:t>: 1–5</w:t>
-      </w:r>
-      <w:r>
-        <w:br/>
-        <w:t xml:space="preserve">- </w:t>
-      </w:r>
-      <w:proofErr w:type="spellStart"/>
-      <w:r>
-        <w:t>hidden_risk</w:t>
-      </w:r>
-      <w:proofErr w:type="spellEnd"/>
-      <w:r>
-        <w:t>: 1–5</w:t>
-      </w:r>
-    </w:p>
+        <w:t>“How clearly can this prompt distinguish this dimension from the others?”</w:t>
+      </w:r>
+    </w:p>
+    <w:p>
+      <w:r>
+        <w:t>Example:</w:t>
+      </w:r>
+    </w:p>
+    <w:p>
+      <w:pPr>
+        <w:numPr>
+          <w:ilvl w:val="0"/>
+          <w:numId w:val="4"/>
+        </w:numPr>
+      </w:pPr>
+      <w:r>
+        <w:t>maybe the model can score trajectory confidently</w:t>
+      </w:r>
+    </w:p>
+    <w:p>
+      <w:pPr>
+        <w:numPr>
+          <w:ilvl w:val="0"/>
+          <w:numId w:val="4"/>
+        </w:numPr>
+      </w:pPr>
+      <w:r>
+        <w:t>but career coherence is ambiguous</w:t>
+      </w:r>
+    </w:p>
+    <w:p>
+      <w:r>
+        <w:t>Also useful.</w:t>
+      </w:r>
+    </w:p>
+    <w:p>
+      <w:pPr>
+        <w:rPr>
+          <w:b/>
+          <w:bCs/>
+        </w:rPr>
+      </w:pPr>
+      <w:r>
+        <w:rPr>
+          <w:b/>
+          <w:bCs/>
+        </w:rPr>
+        <w:t>3. Prediction certainty</w:t>
+      </w:r>
+    </w:p>
+    <w:p>
+      <w:r>
+        <w:t>“How certain are you this founder will succeed?”</w:t>
+      </w:r>
+    </w:p>
+    <w:p>
+      <w:r>
+        <w:t>This is much less useful, because it tends to collapse back into a hidden overall prediction and can leak broad priors.</w:t>
+      </w:r>
+    </w:p>
+    <w:p>
+      <w:r>
+        <w:t>So I would avoid generic “success confidence.”</w:t>
+      </w:r>
+    </w:p>
+    <w:p/>
     <w:sectPr>
       <w:pgSz w:w="11906" w:h="16838"/>
       <w:pgMar w:top="1440" w:right="1440" w:bottom="1440" w:left="1440" w:header="708" w:footer="708" w:gutter="0"/>
@@ -1060,9 +1271,307 @@
     </w:lvl>
   </w:abstractNum>
   <w:abstractNum w:abstractNumId="1" w15:restartNumberingAfterBreak="0">
+    <w:nsid w:val="29DF1BF0"/>
+    <w:multiLevelType w:val="multilevel"/>
+    <w:tmpl w:val="1688C120"/>
+    <w:lvl w:ilvl="0">
+      <w:start w:val="1"/>
+      <w:numFmt w:val="bullet"/>
+      <w:lvlText w:val=""/>
+      <w:lvlJc w:val="left"/>
+      <w:pPr>
+        <w:tabs>
+          <w:tab w:val="num" w:pos="720"/>
+        </w:tabs>
+        <w:ind w:left="720" w:hanging="360"/>
+      </w:pPr>
+      <w:rPr>
+        <w:rFonts w:ascii="Symbol" w:hAnsi="Symbol" w:hint="default"/>
+        <w:sz w:val="20"/>
+      </w:rPr>
+    </w:lvl>
+    <w:lvl w:ilvl="1" w:tentative="1">
+      <w:start w:val="1"/>
+      <w:numFmt w:val="bullet"/>
+      <w:lvlText w:val="o"/>
+      <w:lvlJc w:val="left"/>
+      <w:pPr>
+        <w:tabs>
+          <w:tab w:val="num" w:pos="1440"/>
+        </w:tabs>
+        <w:ind w:left="1440" w:hanging="360"/>
+      </w:pPr>
+      <w:rPr>
+        <w:rFonts w:ascii="Courier New" w:hAnsi="Courier New" w:hint="default"/>
+        <w:sz w:val="20"/>
+      </w:rPr>
+    </w:lvl>
+    <w:lvl w:ilvl="2" w:tentative="1">
+      <w:start w:val="1"/>
+      <w:numFmt w:val="bullet"/>
+      <w:lvlText w:val=""/>
+      <w:lvlJc w:val="left"/>
+      <w:pPr>
+        <w:tabs>
+          <w:tab w:val="num" w:pos="2160"/>
+        </w:tabs>
+        <w:ind w:left="2160" w:hanging="360"/>
+      </w:pPr>
+      <w:rPr>
+        <w:rFonts w:ascii="Wingdings" w:hAnsi="Wingdings" w:hint="default"/>
+        <w:sz w:val="20"/>
+      </w:rPr>
+    </w:lvl>
+    <w:lvl w:ilvl="3" w:tentative="1">
+      <w:start w:val="1"/>
+      <w:numFmt w:val="bullet"/>
+      <w:lvlText w:val=""/>
+      <w:lvlJc w:val="left"/>
+      <w:pPr>
+        <w:tabs>
+          <w:tab w:val="num" w:pos="2880"/>
+        </w:tabs>
+        <w:ind w:left="2880" w:hanging="360"/>
+      </w:pPr>
+      <w:rPr>
+        <w:rFonts w:ascii="Wingdings" w:hAnsi="Wingdings" w:hint="default"/>
+        <w:sz w:val="20"/>
+      </w:rPr>
+    </w:lvl>
+    <w:lvl w:ilvl="4" w:tentative="1">
+      <w:start w:val="1"/>
+      <w:numFmt w:val="bullet"/>
+      <w:lvlText w:val=""/>
+      <w:lvlJc w:val="left"/>
+      <w:pPr>
+        <w:tabs>
+          <w:tab w:val="num" w:pos="3600"/>
+        </w:tabs>
+        <w:ind w:left="3600" w:hanging="360"/>
+      </w:pPr>
+      <w:rPr>
+        <w:rFonts w:ascii="Wingdings" w:hAnsi="Wingdings" w:hint="default"/>
+        <w:sz w:val="20"/>
+      </w:rPr>
+    </w:lvl>
+    <w:lvl w:ilvl="5" w:tentative="1">
+      <w:start w:val="1"/>
+      <w:numFmt w:val="bullet"/>
+      <w:lvlText w:val=""/>
+      <w:lvlJc w:val="left"/>
+      <w:pPr>
+        <w:tabs>
+          <w:tab w:val="num" w:pos="4320"/>
+        </w:tabs>
+        <w:ind w:left="4320" w:hanging="360"/>
+      </w:pPr>
+      <w:rPr>
+        <w:rFonts w:ascii="Wingdings" w:hAnsi="Wingdings" w:hint="default"/>
+        <w:sz w:val="20"/>
+      </w:rPr>
+    </w:lvl>
+    <w:lvl w:ilvl="6" w:tentative="1">
+      <w:start w:val="1"/>
+      <w:numFmt w:val="bullet"/>
+      <w:lvlText w:val=""/>
+      <w:lvlJc w:val="left"/>
+      <w:pPr>
+        <w:tabs>
+          <w:tab w:val="num" w:pos="5040"/>
+        </w:tabs>
+        <w:ind w:left="5040" w:hanging="360"/>
+      </w:pPr>
+      <w:rPr>
+        <w:rFonts w:ascii="Wingdings" w:hAnsi="Wingdings" w:hint="default"/>
+        <w:sz w:val="20"/>
+      </w:rPr>
+    </w:lvl>
+    <w:lvl w:ilvl="7" w:tentative="1">
+      <w:start w:val="1"/>
+      <w:numFmt w:val="bullet"/>
+      <w:lvlText w:val=""/>
+      <w:lvlJc w:val="left"/>
+      <w:pPr>
+        <w:tabs>
+          <w:tab w:val="num" w:pos="5760"/>
+        </w:tabs>
+        <w:ind w:left="5760" w:hanging="360"/>
+      </w:pPr>
+      <w:rPr>
+        <w:rFonts w:ascii="Wingdings" w:hAnsi="Wingdings" w:hint="default"/>
+        <w:sz w:val="20"/>
+      </w:rPr>
+    </w:lvl>
+    <w:lvl w:ilvl="8" w:tentative="1">
+      <w:start w:val="1"/>
+      <w:numFmt w:val="bullet"/>
+      <w:lvlText w:val=""/>
+      <w:lvlJc w:val="left"/>
+      <w:pPr>
+        <w:tabs>
+          <w:tab w:val="num" w:pos="6480"/>
+        </w:tabs>
+        <w:ind w:left="6480" w:hanging="360"/>
+      </w:pPr>
+      <w:rPr>
+        <w:rFonts w:ascii="Wingdings" w:hAnsi="Wingdings" w:hint="default"/>
+        <w:sz w:val="20"/>
+      </w:rPr>
+    </w:lvl>
+  </w:abstractNum>
+  <w:abstractNum w:abstractNumId="2" w15:restartNumberingAfterBreak="0">
     <w:nsid w:val="615133E0"/>
     <w:multiLevelType w:val="multilevel"/>
     <w:tmpl w:val="9D3A6A78"/>
+    <w:lvl w:ilvl="0">
+      <w:start w:val="1"/>
+      <w:numFmt w:val="bullet"/>
+      <w:lvlText w:val=""/>
+      <w:lvlJc w:val="left"/>
+      <w:pPr>
+        <w:tabs>
+          <w:tab w:val="num" w:pos="720"/>
+        </w:tabs>
+        <w:ind w:left="720" w:hanging="360"/>
+      </w:pPr>
+      <w:rPr>
+        <w:rFonts w:ascii="Symbol" w:hAnsi="Symbol" w:hint="default"/>
+        <w:sz w:val="20"/>
+      </w:rPr>
+    </w:lvl>
+    <w:lvl w:ilvl="1" w:tentative="1">
+      <w:start w:val="1"/>
+      <w:numFmt w:val="bullet"/>
+      <w:lvlText w:val="o"/>
+      <w:lvlJc w:val="left"/>
+      <w:pPr>
+        <w:tabs>
+          <w:tab w:val="num" w:pos="1440"/>
+        </w:tabs>
+        <w:ind w:left="1440" w:hanging="360"/>
+      </w:pPr>
+      <w:rPr>
+        <w:rFonts w:ascii="Courier New" w:hAnsi="Courier New" w:hint="default"/>
+        <w:sz w:val="20"/>
+      </w:rPr>
+    </w:lvl>
+    <w:lvl w:ilvl="2" w:tentative="1">
+      <w:start w:val="1"/>
+      <w:numFmt w:val="bullet"/>
+      <w:lvlText w:val=""/>
+      <w:lvlJc w:val="left"/>
+      <w:pPr>
+        <w:tabs>
+          <w:tab w:val="num" w:pos="2160"/>
+        </w:tabs>
+        <w:ind w:left="2160" w:hanging="360"/>
+      </w:pPr>
+      <w:rPr>
+        <w:rFonts w:ascii="Wingdings" w:hAnsi="Wingdings" w:hint="default"/>
+        <w:sz w:val="20"/>
+      </w:rPr>
+    </w:lvl>
+    <w:lvl w:ilvl="3" w:tentative="1">
+      <w:start w:val="1"/>
+      <w:numFmt w:val="bullet"/>
+      <w:lvlText w:val=""/>
+      <w:lvlJc w:val="left"/>
+      <w:pPr>
+        <w:tabs>
+          <w:tab w:val="num" w:pos="2880"/>
+        </w:tabs>
+        <w:ind w:left="2880" w:hanging="360"/>
+      </w:pPr>
+      <w:rPr>
+        <w:rFonts w:ascii="Wingdings" w:hAnsi="Wingdings" w:hint="default"/>
+        <w:sz w:val="20"/>
+      </w:rPr>
+    </w:lvl>
+    <w:lvl w:ilvl="4" w:tentative="1">
+      <w:start w:val="1"/>
+      <w:numFmt w:val="bullet"/>
+      <w:lvlText w:val=""/>
+      <w:lvlJc w:val="left"/>
+      <w:pPr>
+        <w:tabs>
+          <w:tab w:val="num" w:pos="3600"/>
+        </w:tabs>
+        <w:ind w:left="3600" w:hanging="360"/>
+      </w:pPr>
+      <w:rPr>
+        <w:rFonts w:ascii="Wingdings" w:hAnsi="Wingdings" w:hint="default"/>
+        <w:sz w:val="20"/>
+      </w:rPr>
+    </w:lvl>
+    <w:lvl w:ilvl="5" w:tentative="1">
+      <w:start w:val="1"/>
+      <w:numFmt w:val="bullet"/>
+      <w:lvlText w:val=""/>
+      <w:lvlJc w:val="left"/>
+      <w:pPr>
+        <w:tabs>
+          <w:tab w:val="num" w:pos="4320"/>
+        </w:tabs>
+        <w:ind w:left="4320" w:hanging="360"/>
+      </w:pPr>
+      <w:rPr>
+        <w:rFonts w:ascii="Wingdings" w:hAnsi="Wingdings" w:hint="default"/>
+        <w:sz w:val="20"/>
+      </w:rPr>
+    </w:lvl>
+    <w:lvl w:ilvl="6" w:tentative="1">
+      <w:start w:val="1"/>
+      <w:numFmt w:val="bullet"/>
+      <w:lvlText w:val=""/>
+      <w:lvlJc w:val="left"/>
+      <w:pPr>
+        <w:tabs>
+          <w:tab w:val="num" w:pos="5040"/>
+        </w:tabs>
+        <w:ind w:left="5040" w:hanging="360"/>
+      </w:pPr>
+      <w:rPr>
+        <w:rFonts w:ascii="Wingdings" w:hAnsi="Wingdings" w:hint="default"/>
+        <w:sz w:val="20"/>
+      </w:rPr>
+    </w:lvl>
+    <w:lvl w:ilvl="7" w:tentative="1">
+      <w:start w:val="1"/>
+      <w:numFmt w:val="bullet"/>
+      <w:lvlText w:val=""/>
+      <w:lvlJc w:val="left"/>
+      <w:pPr>
+        <w:tabs>
+          <w:tab w:val="num" w:pos="5760"/>
+        </w:tabs>
+        <w:ind w:left="5760" w:hanging="360"/>
+      </w:pPr>
+      <w:rPr>
+        <w:rFonts w:ascii="Wingdings" w:hAnsi="Wingdings" w:hint="default"/>
+        <w:sz w:val="20"/>
+      </w:rPr>
+    </w:lvl>
+    <w:lvl w:ilvl="8" w:tentative="1">
+      <w:start w:val="1"/>
+      <w:numFmt w:val="bullet"/>
+      <w:lvlText w:val=""/>
+      <w:lvlJc w:val="left"/>
+      <w:pPr>
+        <w:tabs>
+          <w:tab w:val="num" w:pos="6480"/>
+        </w:tabs>
+        <w:ind w:left="6480" w:hanging="360"/>
+      </w:pPr>
+      <w:rPr>
+        <w:rFonts w:ascii="Wingdings" w:hAnsi="Wingdings" w:hint="default"/>
+        <w:sz w:val="20"/>
+      </w:rPr>
+    </w:lvl>
+  </w:abstractNum>
+  <w:abstractNum w:abstractNumId="3" w15:restartNumberingAfterBreak="0">
+    <w:nsid w:val="733A38FE"/>
+    <w:multiLevelType w:val="multilevel"/>
+    <w:tmpl w:val="70F6F8EE"/>
     <w:lvl w:ilvl="0">
       <w:start w:val="1"/>
       <w:numFmt w:val="bullet"/>
@@ -1212,6 +1721,12 @@
     <w:abstractNumId w:val="0"/>
   </w:num>
   <w:num w:numId="2" w16cid:durableId="122044120">
+    <w:abstractNumId w:val="2"/>
+  </w:num>
+  <w:num w:numId="3" w16cid:durableId="945310535">
+    <w:abstractNumId w:val="3"/>
+  </w:num>
+  <w:num w:numId="4" w16cid:durableId="755177700">
     <w:abstractNumId w:val="1"/>
   </w:num>
 </w:numbering>
@@ -1649,7 +2164,6 @@
     <w:next w:val="Normal"/>
     <w:link w:val="Heading2Char"/>
     <w:uiPriority w:val="9"/>
-    <w:semiHidden/>
     <w:unhideWhenUsed/>
     <w:qFormat/>
     <w:rsid w:val="00110DF9"/>
@@ -1852,7 +2366,6 @@
     <w:basedOn w:val="DefaultParagraphFont"/>
     <w:link w:val="Heading2"/>
     <w:uiPriority w:val="9"/>
-    <w:semiHidden/>
     <w:rsid w:val="00110DF9"/>
     <w:rPr>
       <w:rFonts w:ascii="Calibri" w:eastAsiaTheme="majorEastAsia" w:hAnsi="Calibri" w:cstheme="majorBidi"/>

</xml_diff>